<commit_message>
update srs and review database
</commit_message>
<xml_diff>
--- a/SRS_SIM_Madrasah_MTs_Al_Karimiyyah_2026_2027_Revisi_v1_2.docx
+++ b/SRS_SIM_Madrasah_MTs_Al_Karimiyyah_2026_2027_Revisi_v1_2.docx
@@ -32,7 +32,7 @@
     </w:p>
     <w:p>
       <w:r>
-        <w:t xml:space="preserve">REVISI v1.2 • Laravel API + Next.js/React • Default implementasi • 14 Oktober 2026</w:t>
+        <w:t xml:space="preserve">REVISI v1.2 • Addendum absensi foto + GPS • 20 Oktober 2026</w:t>
       </w:r>
     </w:p>
     <w:tbl>
@@ -115,7 +115,7 @@
               <w:rPr>
                 <w:sz w:val="18"/>
               </w:rPr>
-              <w:t xml:space="preserve">Baseline pengembangan v1.2; stack Laravel API + Next.js/React dan default operasional ditetapkan untuk implementasi awal.</w:t>
+              <w:t xml:space="preserve">Baseline pengembangan v1.2 dengan addendum absensi pegawai 20 Oktober 2026; default lainnya tetap mengikuti revisi 14 Oktober 2026.</w:t>
             </w:r>
           </w:p>
         </w:tc>
@@ -152,7 +152,7 @@
               <w:rPr>
                 <w:sz w:val="18"/>
               </w:rPr>
-              <w:t xml:space="preserve">Revisi v1.1 tanggal 9 Oktober 2026 dan arahan pemilik proyek tanggal 14 Oktober 2026.</w:t>
+              <w:t xml:space="preserve">Revisi v1.1 tanggal 9 Oktober 2026, baseline 14 Oktober 2026, dan konfirmasi pemilik proyek 20 Oktober 2026: foto + GPS hanya untuk masuk/pulang pegawai.</w:t>
             </w:r>
           </w:p>
         </w:tc>
@@ -189,7 +189,7 @@
               <w:rPr>
                 <w:sz w:val="18"/>
               </w:rPr>
-              <w:t xml:space="preserve">Penggantian stack, default DEC-01–DEC-19, kontrak API, keamanan cache, histori kategori/kelas, snapshot laporan dan koreksi honor.</w:t>
+              <w:t xml:space="preserve">Baseline v1.2 dipertahankan; addendum mengaktifkan foto kamera + GPS untuk masuk/pulang pegawai, kompresi sebelum penyimpanan, bukti privat dan policy berversi. Absensi siswa serta default lainnya tetap.</w:t>
             </w:r>
           </w:p>
         </w:tc>
@@ -358,6 +358,14 @@
       </w:pPr>
       <w:r>
         <w:t xml:space="preserve">Menetapkan Laravel API + Next.js/React/TypeScript + MySQL; melengkapi baseline cakupan, API, autentikasi, default operasional, histori kategori pegawai, snapshot laporan, dan koreksi penerima honor.</w:t>
+      </w:r>
+    </w:p>
+    <w:p>
+      <w:pPr>
+        <w:pStyle w:val="ListBullet"/>
+      </w:pPr>
+      <w:r>
+        <w:t xml:space="preserve">Addendum 20 Oktober 2026: foto + GPS hanya untuk masuk/pulang pegawai; kompresi server sebelum penyimpanan; revisi FR-05, NFR-05, DEC-16 dan AC-33–AC-35. Default lainnya tetap. Nama file v1_2 dipertahankan sebagai dokumen kanonik yang diminta pemilik proyek.</w:t>
       </w:r>
     </w:p>
     <w:p>
@@ -594,7 +602,7 @@
               <w:rPr>
                 <w:sz w:val="18"/>
               </w:rPr>
-              <w:t xml:space="preserve">Input web satu shift; GPS/foto/biometrik dan absensi siswa pertemuan/both nonaktif.</w:t>
+              <w:t xml:space="preserve">Input web satu shift; foto + GPS aktif hanya untuk masuk/pulang pegawai. Biometrik dan absensi siswa pertemuan/both tetap nonaktif.</w:t>
             </w:r>
           </w:p>
         </w:tc>
@@ -2794,7 +2802,7 @@
               <w:rPr>
                 <w:sz w:val="18"/>
               </w:rPr>
-              <w:t>Catat masuk/pulang menggunakan waktu server serta status hadir, izin, sakit, cuti, dinas luar sesuai referensi.</w:t>
+              <w:t>Catat masuk/pulang pegawai menggunakan waktu server; setiap aksi normal wajib foto baru dari kamera dan GPS perangkat. Petugas tetap mencatat izin, sakit, cuti, dinas luar sesuai referensi tanpa mewajibkan foto/GPS kehadiran. Absensi siswa tetap dicatat guru/wali kelas.</w:t>
             </w:r>
           </w:p>
         </w:tc>
@@ -2831,7 +2839,7 @@
               <w:rPr>
                 <w:sz w:val="18"/>
               </w:rPr>
-              <w:t>Tolak pencatatan ganda sesuai pola kerja; koreksi menyimpan sebelum/sesudah, alasan, pelaku, dan waktu.</w:t>
+              <w:t>Tolak pencatatan ganda sesuai pola kerja dan aksi masuk/pulang. Koreksi menyimpan sebelum/sesudah, alasan, pelaku, waktu serta approval; bukti foto/GPS asli tidak ditimpa. Riwayat sebelum policy foto/GPS berlaku tetap sah tanpa bukti retroaktif.</w:t>
             </w:r>
           </w:p>
         </w:tc>
@@ -2869,6 +2877,117 @@
                 <w:sz w:val="18"/>
               </w:rPr>
               <w:t xml:space="preserve">Rekap harian/bulanan dan terlambat memakai snapshot shift Senin–Sabtu 07.00–14.00, toleransi 10 menit dan koreksi 7 hari.</w:t>
+            </w:r>
+          </w:p>
+        </w:tc>
+      </w:tr>
+      <w:tr>
+        <w:trPr>
+          <w:cantSplit/>
+        </w:trPr>
+        <w:tc>
+          <w:tcPr>
+            <w:tcW w:type="dxa" w:w="4734"/>
+          </w:tcPr>
+          <w:p>
+            <w:pPr>
+              <w:spacing w:after="80"/>
+            </w:pPr>
+            <w:r>
+              <w:rPr>
+                <w:sz w:val="18"/>
+              </w:rPr>
+              <w:t>FR-05-04</w:t>
+            </w:r>
+          </w:p>
+        </w:tc>
+        <w:tc>
+          <w:tcPr>
+            <w:tcW w:type="dxa" w:w="4734"/>
+          </w:tcPr>
+          <w:p>
+            <w:pPr>
+              <w:spacing w:after="80"/>
+            </w:pPr>
+            <w:r>
+              <w:rPr>
+                <w:sz w:val="18"/>
+              </w:rPr>
+              <w:t xml:space="preserve">Setiap aksi masuk/pulang normal mengikat foto kamera baru, latitude/longitude, akurasi, waktu foto/lokasi dan waktu server dengan kunci idempotensi; bukti disimpan terpisah dan privat. Default akurasi maksimal 100 m dan usia foto/lokasi maksimal 60 detik, tanpa geofence. Kamera/GPS gagal atau tidak diizinkan menolak aksi normal; tidak ada fallback diam-diam.</w:t>
+            </w:r>
+          </w:p>
+        </w:tc>
+      </w:tr>
+      <w:tr>
+        <w:trPr>
+          <w:cantSplit/>
+        </w:trPr>
+        <w:tc>
+          <w:tcPr>
+            <w:tcW w:type="dxa" w:w="4734"/>
+          </w:tcPr>
+          <w:p>
+            <w:pPr>
+              <w:spacing w:after="80"/>
+            </w:pPr>
+            <w:r>
+              <w:rPr>
+                <w:sz w:val="18"/>
+              </w:rPr>
+              <w:t>FR-05-05</w:t>
+            </w:r>
+          </w:p>
+        </w:tc>
+        <w:tc>
+          <w:tcPr>
+            <w:tcW w:type="dxa" w:w="4734"/>
+          </w:tcPr>
+          <w:p>
+            <w:pPr>
+              <w:spacing w:after="80"/>
+            </w:pPr>
+            <w:r>
+              <w:rPr>
+                <w:sz w:val="18"/>
+              </w:rPr>
+              <w:t xml:space="preserve">Server memvalidasi foto lalu mengompresi sebelum penyimpanan final: WebP, sisi terpanjang 1.280 px tanpa upscale, kualitas awal 80 sampai minimum 60 untuk maksimal 300 KiB; EXIF dihapus setelah orientasi diperbaiki. files menyimpan metadata hasil, employee_attendance_captures menyimpan FK, ukuran input, dimensi/kualitas aktual serta snapshot policy. Byte foto bukan isi database.</w:t>
+            </w:r>
+          </w:p>
+        </w:tc>
+      </w:tr>
+      <w:tr>
+        <w:trPr>
+          <w:cantSplit/>
+        </w:trPr>
+        <w:tc>
+          <w:tcPr>
+            <w:tcW w:type="dxa" w:w="4734"/>
+          </w:tcPr>
+          <w:p>
+            <w:pPr>
+              <w:spacing w:after="80"/>
+            </w:pPr>
+            <w:r>
+              <w:rPr>
+                <w:sz w:val="18"/>
+              </w:rPr>
+              <w:t>FR-05-06</w:t>
+            </w:r>
+          </w:p>
+        </w:tc>
+        <w:tc>
+          <w:tcPr>
+            <w:tcW w:type="dxa" w:w="4734"/>
+          </w:tcPr>
+          <w:p>
+            <w:pPr>
+              <w:spacing w:after="80"/>
+            </w:pPr>
+            <w:r>
+              <w:rPr>
+                <w:sz w:val="18"/>
+              </w:rPr>
+              <w:t xml:space="preserve">Policy foto/GPS dan DEC-16 dibuat sebagai versi efektif baru; data/policy lama tidak ditimpa dan tidak diwajibkan foto/GPS retroaktif. Akses bukti dibatasi ke pemilik/petugas absensi bermandat. Koreksi administratif tetap mengikuti alasan, approval berbeda dan audit; bukti asli dipertahankan.</w:t>
             </w:r>
           </w:p>
         </w:tc>
@@ -5223,6 +5342,22 @@
       </w:pPr>
       <w:r>
         <w:t xml:space="preserve">BR-10: input siswa sampai 23.59 lokal; koreksi siswa/pegawai sampai 7 hari kalender memerlukan alasan dan persetujuan petugas berbeda. Setelah tenggat hanya izin koreksi terlambat eksplisit. Simpan sebelum/sesudah, pelaku, waktu, approval dan lock_version.</w:t>
+      </w:r>
+    </w:p>
+    <w:p>
+      <w:pPr>
+        <w:pStyle w:val="ListBullet"/>
+      </w:pPr>
+      <w:r>
+        <w:t xml:space="preserve">BR-24 (addendum absensi pegawai): foto dan GPS dikumpulkan untuk aksi check_in/check_out saja. Lokasi berupa latitude/longitude, akurasi dan waktu pengambilan; waktu kejadian absensi memakai server UTC. Default teknis: akurasi maksimal 100 m dan usia foto/lokasi maksimal 60 detik, tidak dari masa depan, tanpa radius/geofence. HTTPS serta izin kamera/lokasi wajib; izin ditolak, lokasi kedaluwarsa/tidak akurat, foto kosong atau kompresi gagal membuat aksi normal ditolak. Pegawai mengulang pengambilan; penanganan administratif hanya melalui petugas bermandat, alasan, approval/koreksi dan audit yang sudah berlaku, bukan membuat bukti kamera/GPS palsu. Foto/GPS bukan verifikasi biometrik atau jaminan anti-pemalsuan.</w:t>
+      </w:r>
+    </w:p>
+    <w:p>
+      <w:pPr>
+        <w:pStyle w:val="ListBullet"/>
+      </w:pPr>
+      <w:r>
+        <w:t xml:space="preserve">BR-25 (penyimpanan bukti): validasi dan kompresi foto selesai sebelum file final, metadata files, bukti dan waktu absensi dikomit. File final privat berformat WebP; database tidak menyimpan byte foto/base64. Satu bukti unik per absensi–aksi dan satu file tidak dipakai dua aksi. File sementara/asli dibersihkan; kegagalan database/storage tidak meninggalkan absensi sukses parsial. Bukti asli append-only dan tidak ditimpa koreksi; foto/GPS tidak masuk publik, portal wali, payload/log umum atau ekspor rutin. Akses hanya pegawai pemilik dan petugas absensi bermandat. Retensi mengikuti akademik/absensi 5 tahun setelah penutupan periode, tanpa penghapusan historis otomatis.</w:t>
       </w:r>
     </w:p>
     <w:p>
@@ -5996,7 +6131,7 @@
               <w:rPr>
                 <w:sz w:val="18"/>
               </w:rPr>
-              <w:t xml:space="preserve">Berkas privat, nama server acak, MIME/isi diperiksa; maksimal 10 MiB, PNG/JPEG/WebP/PDF untuk lampiran. CSV/XLSX hanya importer khusus, maksimal 5.000 baris. HTML/SVG/executable dan arsip terkompresi ditolak.</w:t>
+              <w:t xml:space="preserve">Berkas privat, nama server acak, MIME/isi diperiksa; maksimal 10 MiB, PNG/JPEG/WebP/PDF untuk lampiran. Foto absensi hanya PNG/JPEG/WebP, input maksimal 10 MiB dan 20 megapiksel; server memperbaiki orientasi, menghapus EXIF, meresize tanpa memperbesar ke sisi terpanjang 1.280 px dan mengenkode WebP kualitas awal 80, diturunkan bertahap sampai 60 bila perlu untuk hasil maksimal 300 KiB (307.200 byte). Bila tetap melebihi batas atau decode/encode gagal, absensi ditolak tanpa catatan parsial. CSV/XLSX hanya importer khusus, maksimal 5.000 baris. HTML/SVG/executable dan arsip terkompresi ditolak.</w:t>
             </w:r>
           </w:p>
         </w:tc>
@@ -6012,7 +6147,7 @@
               <w:rPr>
                 <w:sz w:val="18"/>
               </w:rPr>
-              <w:t xml:space="preserve">Uji berkas terlarang, berkas terlalu besar, serta unduhan tanpa izin. Batas berbeda per kategori dapat diputuskan.</w:t>
+              <w:t xml:space="preserve">Uji MIME palsu, berkas rusak/terlarang, input di atas 10 MiB/20 megapiksel, output di atas 300 KiB, orientasi/EXIF, kegagalan kompresi, serta unduhan foto tanpa izin. Parameter foto/GPS disimpan pada versi policy, bukan menimpa histori.</w:t>
             </w:r>
           </w:p>
         </w:tc>
@@ -7521,7 +7656,7 @@
               <w:rPr>
                 <w:sz w:val="18"/>
               </w:rPr>
-              <w:t xml:space="preserve">absensi_pegawai, absensi_siswa_harian dan/atau absensi_siswa_pertemuan; realisasi_mengajar, verifikasi_realisasi, riwayat_koreksi.</w:t>
+              <w:t xml:space="preserve">absensi_pegawai dan employee_attendance_captures untuk bukti foto/GPS per aksi masuk/pulang; absensi_siswa_harian, absensi_siswa_pertemuan nonaktif; realisasi_mengajar, verifikasi_realisasi, riwayat_koreksi. File terkompresi disimpan privat; database hanya menyimpan FK dan metadata, tanpa BLOB/base64.</w:t>
             </w:r>
           </w:p>
         </w:tc>
@@ -9552,7 +9687,7 @@
               <w:rPr>
                 <w:sz w:val="18"/>
               </w:rPr>
-              <w:t xml:space="preserve">Absensi masuk dikirim dua kali lalu dikoreksi petugas.</w:t>
+              <w:t xml:space="preserve">Absensi masuk dengan foto/GPS dikirim dua kali/paralel, lalu pegawai mencatat pulang dengan bukti baru dan petugas mengoreksi waktu melalui approval.</w:t>
             </w:r>
           </w:p>
         </w:tc>
@@ -9568,7 +9703,7 @@
               <w:rPr>
                 <w:sz w:val="18"/>
               </w:rPr>
-              <w:t xml:space="preserve">Tidak ganda; koreksi beralasan/tercatat; tidak otomatis menjadi JP mengajar.</w:t>
+              <w:t xml:space="preserve">Satu absensi hari kerja dan satu bukti per aksi; foto masuk/pulang berbeda. Koreksi beralasan/tercatat mempertahankan bukti asli; tidak otomatis menjadi JP mengajar.</w:t>
             </w:r>
           </w:p>
         </w:tc>
@@ -11346,7 +11481,7 @@
               <w:rPr>
                 <w:sz w:val="18"/>
               </w:rPr>
-              <w:t xml:space="preserve">Coba login siswa, DOCX, disposisi, GPS/biometrik dan pembayaran.</w:t>
+              <w:t xml:space="preserve">Coba login siswa, DOCX, disposisi, biometrik dan pembayaran; pastikan absensi siswa tidak meminta foto/GPS.</w:t>
             </w:r>
           </w:p>
         </w:tc>
@@ -11363,6 +11498,213 @@
                 <w:sz w:val="18"/>
               </w:rPr>
               <w:t xml:space="preserve">Fitur nonaktif tidak tersedia di UI/API dan tidak membuat transaksi baru.</w:t>
+            </w:r>
+          </w:p>
+        </w:tc>
+      </w:tr>
+      <w:tr>
+        <w:trPr>
+          <w:cantSplit/>
+        </w:trPr>
+        <w:tc>
+          <w:tcPr>
+            <w:tcW w:type="dxa" w:w="2367"/>
+          </w:tcPr>
+          <w:p>
+            <w:pPr>
+              <w:spacing w:after="80"/>
+            </w:pPr>
+            <w:r>
+              <w:rPr>
+                <w:sz w:val="18"/>
+              </w:rPr>
+              <w:t xml:space="preserve">AC-33</w:t>
+            </w:r>
+          </w:p>
+        </w:tc>
+        <w:tc>
+          <w:tcPr>
+            <w:tcW w:type="dxa" w:w="2367"/>
+          </w:tcPr>
+          <w:p>
+            <w:pPr>
+              <w:spacing w:after="80"/>
+            </w:pPr>
+            <w:r>
+              <w:rPr>
+                <w:sz w:val="18"/>
+              </w:rPr>
+              <w:t xml:space="preserve">FR-05-01/04/05; NFR-05; BR-24/25; DEC-16</w:t>
+            </w:r>
+          </w:p>
+        </w:tc>
+        <w:tc>
+          <w:tcPr>
+            <w:tcW w:type="dxa" w:w="2367"/>
+          </w:tcPr>
+          <w:p>
+            <w:pPr>
+              <w:spacing w:after="80"/>
+            </w:pPr>
+            <w:r>
+              <w:rPr>
+                <w:sz w:val="18"/>
+              </w:rPr>
+              <w:t xml:space="preserve">Catat masuk dan pulang dengan dua foto kamera valid beserta GPS; kirim ulang/paralel dan periksa file hasil serta database.</w:t>
+            </w:r>
+          </w:p>
+        </w:tc>
+        <w:tc>
+          <w:tcPr>
+            <w:tcW w:type="dxa" w:w="2367"/>
+          </w:tcPr>
+          <w:p>
+            <w:pPr>
+              <w:spacing w:after="80"/>
+            </w:pPr>
+            <w:r>
+              <w:rPr>
+                <w:sz w:val="18"/>
+              </w:rPr>
+              <w:t xml:space="preserve">Satu absensi dan satu bukti per aksi; WebP &lt;=300 KiB, sisi &lt;=1.280 px tanpa upscale, kualitas aktual tercatat, EXIF dibuang. Foto privat di storage; DB hanya FK/metadata GPS; jam absensi dari server.</w:t>
+            </w:r>
+          </w:p>
+        </w:tc>
+      </w:tr>
+      <w:tr>
+        <w:trPr>
+          <w:cantSplit/>
+        </w:trPr>
+        <w:tc>
+          <w:tcPr>
+            <w:tcW w:type="dxa" w:w="2367"/>
+          </w:tcPr>
+          <w:p>
+            <w:pPr>
+              <w:spacing w:after="80"/>
+            </w:pPr>
+            <w:r>
+              <w:rPr>
+                <w:sz w:val="18"/>
+              </w:rPr>
+              <w:t xml:space="preserve">AC-34</w:t>
+            </w:r>
+          </w:p>
+        </w:tc>
+        <w:tc>
+          <w:tcPr>
+            <w:tcW w:type="dxa" w:w="2367"/>
+          </w:tcPr>
+          <w:p>
+            <w:pPr>
+              <w:spacing w:after="80"/>
+            </w:pPr>
+            <w:r>
+              <w:rPr>
+                <w:sz w:val="18"/>
+              </w:rPr>
+              <w:t xml:space="preserve">FR-05-04/05/06; NFR-05/09; BR-24/25</w:t>
+            </w:r>
+          </w:p>
+        </w:tc>
+        <w:tc>
+          <w:tcPr>
+            <w:tcW w:type="dxa" w:w="2367"/>
+          </w:tcPr>
+          <w:p>
+            <w:pPr>
+              <w:spacing w:after="80"/>
+            </w:pPr>
+            <w:r>
+              <w:rPr>
+                <w:sz w:val="18"/>
+              </w:rPr>
+              <w:t xml:space="preserve">Tolak izin kamera/lokasi; gunakan akurasi &gt;100 m, usia foto/lokasi &gt;60 detik, koordinat di luar rentang, foto rusak/input berlebih, kegagalan kompresi/storage/commit; coba URL sebagai pengguna lain.</w:t>
+            </w:r>
+          </w:p>
+        </w:tc>
+        <w:tc>
+          <w:tcPr>
+            <w:tcW w:type="dxa" w:w="2367"/>
+          </w:tcPr>
+          <w:p>
+            <w:pPr>
+              <w:spacing w:after="80"/>
+            </w:pPr>
+            <w:r>
+              <w:rPr>
+                <w:sz w:val="18"/>
+              </w:rPr>
+              <w:t xml:space="preserve">Aksi normal ditolak tanpa absensi/bukti parsial; file sementara/yatim dibersihkan. Bukti privat tidak terbuka; tidak ada bypass otomatis atau foto/GPS buatan. Retry valid tetap idempoten.</w:t>
+            </w:r>
+          </w:p>
+        </w:tc>
+      </w:tr>
+      <w:tr>
+        <w:trPr>
+          <w:cantSplit/>
+        </w:trPr>
+        <w:tc>
+          <w:tcPr>
+            <w:tcW w:type="dxa" w:w="2367"/>
+          </w:tcPr>
+          <w:p>
+            <w:pPr>
+              <w:spacing w:after="80"/>
+            </w:pPr>
+            <w:r>
+              <w:rPr>
+                <w:sz w:val="18"/>
+              </w:rPr>
+              <w:t xml:space="preserve">AC-35</w:t>
+            </w:r>
+          </w:p>
+        </w:tc>
+        <w:tc>
+          <w:tcPr>
+            <w:tcW w:type="dxa" w:w="2367"/>
+          </w:tcPr>
+          <w:p>
+            <w:pPr>
+              <w:spacing w:after="80"/>
+            </w:pPr>
+            <w:r>
+              <w:rPr>
+                <w:sz w:val="18"/>
+              </w:rPr>
+              <w:t xml:space="preserve">FR-05-02/06; DEC-07/16; AC-06</w:t>
+            </w:r>
+          </w:p>
+        </w:tc>
+        <w:tc>
+          <w:tcPr>
+            <w:tcW w:type="dxa" w:w="2367"/>
+          </w:tcPr>
+          <w:p>
+            <w:pPr>
+              <w:spacing w:after="80"/>
+            </w:pPr>
+            <w:r>
+              <w:rPr>
+                <w:sz w:val="18"/>
+              </w:rPr>
+              <w:t xml:space="preserve">Migrasikan database berisi absensi/policy lama; buat versi policy foto/GPS baru; koreksi waktu melalui approval dan buka absensi siswa.</w:t>
+            </w:r>
+          </w:p>
+        </w:tc>
+        <w:tc>
+          <w:tcPr>
+            <w:tcW w:type="dxa" w:w="2367"/>
+          </w:tcPr>
+          <w:p>
+            <w:pPr>
+              <w:spacing w:after="80"/>
+            </w:pPr>
+            <w:r>
+              <w:rPr>
+                <w:sz w:val="18"/>
+              </w:rPr>
+              <w:t xml:space="preserve">Riwayat/policy lama tetap; kewajiban bukti mengikuti policy baru prospektif, bukti asli tidak ditimpa koreksi; siswa tetap harian tanpa foto/GPS. Rollback addendum di database uji mempertahankan tabel/absensi lama.</w:t>
             </w:r>
           </w:p>
         </w:tc>
@@ -12584,7 +12926,7 @@
               <w:rPr>
                 <w:sz w:val="18"/>
               </w:rPr>
-              <w:t xml:space="preserve">Satu shift Senin–Sabtu 07.00–14.00 Asia/Jakarta; Minggu/libur tidak wajib kerja. Toleransi terlambat 10 menit. Pegawai mencatat masuk/pulang memakai waktu server; petugas mencatat izin/sakit/cuti/dinas luar. Koreksi 7 hari dengan persetujuan petugas berbeda; selebihnya izin khusus. GPS/foto/biometrik nonaktif.</w:t>
+              <w:t xml:space="preserve">Satu shift Senin–Sabtu 07.00–14.00 Asia/Jakarta; Minggu/libur tidak wajib kerja. Toleransi terlambat 10 menit. Addendum 20 Oktober 2026: masuk/pulang pegawai wajib foto kamera baru + GPS, dikompresi server ke WebP maksimal 300 KiB/sisi 1.280 px/kualitas awal 80. Akurasi GPS maksimal 100 meter dan usia foto/lokasi maksimal 60 detik saat diterima; tanpa geofence pada baseline. Jam absensi tetap waktu server. Petugas mencatat izin/sakit/cuti/dinas luar; koreksi 7 hari dengan persetujuan petugas berbeda, selebihnya izin khusus. Biometrik tetap nonaktif; absensi siswa tetap harian oleh guru/wali kelas. DEC-16 versi baru berlaku prospektif; tanggal efektif operasional ditetapkan saat onboarding, tanpa memaksa bukti pada histori.</w:t>
             </w:r>
           </w:p>
         </w:tc>

</xml_diff>